<commit_message>
feat: add system notifications for expense changes via WSS
- Introduced a new QML component `SystemNotification` to handle system notifications for expense changes (POST/PATCH/DELETE).
- Updated `ExpenseController` to emit `expenseChanged` signal with event details.
- Enhanced integration tests to validate notification publishing and deduplication logic.
- Modified Nginx configuration to streamline request handling.
- Updated documentation to reflect changes in notification handling and validation results.
</commit_message>
<xml_diff>
--- a/kirik/reports/Отчёт_ЛР_02.docx
+++ b/kirik/reports/Отчёт_ЛР_02.docx
@@ -4252,7 +4252,7 @@
         <w:pStyle w:val="Code"/>
       </w:pPr>
       <w:r>
-        <w:t xml:space="preserve">            PageHeader { title: "Задачи · ЛР2"; description: "REST · HTTPS · SQLite" }</w:t>
+        <w:t xml:space="preserve">            PageHeader { title: "Задачи ЛР2" }</w:t>
       </w:r>
     </w:p>
     <w:p>
@@ -5163,7 +5163,7 @@
         <w:pStyle w:val="Code"/>
       </w:pPr>
       <w:r>
-        <w:t xml:space="preserve">            Label { anchors.centerIn: parent; text: "Задачи · ЛР2\n" + tasksController.pendingCount + " в очереди"; horizontalAlignment: Text.AlignHCenter }</w:t>
+        <w:t xml:space="preserve">            Label { anchors.centerIn: parent; text: "Задачи ЛР2\n" + tasksController.pendingCount + " в очереди"; horizontalAlignment: Text.AlignHCenter }</w:t>
       </w:r>
     </w:p>
     <w:p>
@@ -5235,7 +5235,7 @@
         <w:pStyle w:val="Code"/>
       </w:pPr>
       <w:r>
-        <w:t xml:space="preserve">Release: 3</w:t>
+        <w:t xml:space="preserve">Release: 4</w:t>
       </w:r>
     </w:p>
     <w:p>
@@ -5585,7 +5585,7 @@
         <w:pStyle w:val="Code"/>
       </w:pPr>
       <w:r>
-        <w:t xml:space="preserve">Name=Задачи · ЛР2</w:t>
+        <w:t xml:space="preserve">Name=Задачи ЛР2</w:t>
       </w:r>
     </w:p>
     <w:p>
@@ -10163,6 +10163,22 @@
       </w:pPr>
       <w:r>
         <w:t xml:space="preserve">Ручной CRUD через браузеры ПК и Авроры, выбор статуса в форме и полный жестовый показ по DEMONSTRATION.md пользователь ещё не подтвердил. Автоматические тесты и загрузка QML не заменяют эту демонстрацию. Снимки экрана телефона исключены по политике безопасности.</w:t>
+      </w:r>
+    </w:p>
+    <w:p>
+      <w:pPr>
+        <w:pStyle w:val="Heading2"/>
+      </w:pPr>
+      <w:r>
+        <w:t xml:space="preserve">Оформление клиента · 26 октября 2026</w:t>
+      </w:r>
+    </w:p>
+    <w:p>
+      <w:pPr>
+        <w:pStyle w:val="Normal"/>
+      </w:pPr>
+      <w:r>
+        <w:t xml:space="preserve">Технический подзаголовок убран. На главном экране и в меню приложения используется название «Задачи ЛР2». Обновление подписано и установлено с сохранением данных. Установленный MainPage.qml проверен по SSH.</w:t>
       </w:r>
     </w:p>
     <w:p>

</xml_diff>